<commit_message>
Add application: PwC AC, GenAI Software Engineer Senior Associate (resume + cover letter)
</commit_message>
<xml_diff>
--- a/applications/pwc__senior-associate-genai-engineer/cover-letter.docx
+++ b/applications/pwc__senior-associate-genai-engineer/cover-letter.docx
@@ -15,7 +15,7 @@
         <w:pStyle w:val="BodyText"/>
       </w:pPr>
       <w:r>
-        <w:t xml:space="preserve">I build backend systems that take GenAI from prototype to dependable production, which is exactly what PwC’s Acceleration Centers ask of a Senior Associate on the Data and Analytics team. As Lead Architect at Bigstep, I already do this for global enterprises including</w:t>
+        <w:t xml:space="preserve">I build the backend that turns GenAI prototypes into production systems, and PwC’s Acceleration Centers are doing exactly that at enterprise scale. Your Data and Analytics team wants a Senior Associate who can translate business goals into scalable</w:t>
       </w:r>
       <w:r>
         <w:t xml:space="preserve"> </w:t>
@@ -25,13 +25,21 @@
           <w:b/>
           <w:bCs/>
         </w:rPr>
-        <w:t xml:space="preserve">CNBC London</w:t>
-      </w:r>
-      <w:r>
-        <w:t xml:space="preserve"> </w:t>
-      </w:r>
-      <w:r>
-        <w:t xml:space="preserve">and</w:t>
+        <w:t xml:space="preserve">GenAI and Agentic AI</w:t>
+      </w:r>
+      <w:r>
+        <w:t xml:space="preserve"> </w:t>
+      </w:r>
+      <w:r>
+        <w:t xml:space="preserve">software, working across product, ML, and DevOps. That is the work I do now, and I would like to bring it to your client engagements.</w:t>
+      </w:r>
+    </w:p>
+    <w:p>
+      <w:pPr>
+        <w:pStyle w:val="BodyText"/>
+      </w:pPr>
+      <w:r>
+        <w:t xml:space="preserve">Most recently, as Lead Architect at Bigstep Technologies, I orchestrated a</w:t>
       </w:r>
       <w:r>
         <w:t xml:space="preserve"> </w:t>
@@ -41,10 +49,13 @@
           <w:b/>
           <w:bCs/>
         </w:rPr>
-        <w:t xml:space="preserve">VTS</w:t>
-      </w:r>
-      <w:r>
-        <w:t xml:space="preserve">, translating ambiguous business goals into</w:t>
+        <w:t xml:space="preserve">serverless multi-agent</w:t>
+      </w:r>
+      <w:r>
+        <w:t xml:space="preserve"> </w:t>
+      </w:r>
+      <w:r>
+        <w:t xml:space="preserve">framework for Salesforce automation using tool/function calling over</w:t>
       </w:r>
       <w:r>
         <w:t xml:space="preserve"> </w:t>
@@ -54,21 +65,10 @@
           <w:b/>
           <w:bCs/>
         </w:rPr>
-        <w:t xml:space="preserve">event-driven, agentic</w:t>
-      </w:r>
-      <w:r>
-        <w:t xml:space="preserve"> </w:t>
-      </w:r>
-      <w:r>
-        <w:t xml:space="preserve">architectures that clients run in production.</w:t>
-      </w:r>
-    </w:p>
-    <w:p>
-      <w:pPr>
-        <w:pStyle w:val="BodyText"/>
-      </w:pPr>
-      <w:r>
-        <w:t xml:space="preserve">Your role centers on scalable backend solutions, agentic AI, and clean deployment, and my recent work maps directly to it. I orchestrated a</w:t>
+        <w:t xml:space="preserve">MCP (Model Context Protocol)</w:t>
+      </w:r>
+      <w:r>
+        <w:t xml:space="preserve">, cutting idle compute to a pay-per-execution model that saves</w:t>
       </w:r>
       <w:r>
         <w:t xml:space="preserve"> </w:t>
@@ -78,13 +78,10 @@
           <w:b/>
           <w:bCs/>
         </w:rPr>
-        <w:t xml:space="preserve">serverless, event-driven multi-agent</w:t>
-      </w:r>
-      <w:r>
-        <w:t xml:space="preserve"> </w:t>
-      </w:r>
-      <w:r>
-        <w:t xml:space="preserve">framework for Salesforce automation using</w:t>
+        <w:t xml:space="preserve">~$45k/year</w:t>
+      </w:r>
+      <w:r>
+        <w:t xml:space="preserve">. I also architected a Field-Aware Extraction Engine processing</w:t>
       </w:r>
       <w:r>
         <w:t xml:space="preserve"> </w:t>
@@ -94,10 +91,10 @@
           <w:b/>
           <w:bCs/>
         </w:rPr>
-        <w:t xml:space="preserve">tool/function calling over MCP (Model Context Protocol)</w:t>
-      </w:r>
-      <w:r>
-        <w:t xml:space="preserve">, where a pay-per-execution model</w:t>
+        <w:t xml:space="preserve">2M+ records/month</w:t>
+      </w:r>
+      <w:r>
+        <w:t xml:space="preserve">, where a routing layer sends ~60% of fields to deterministic parsers and reserves the LLM for the rest, trimming token spend</w:t>
       </w:r>
       <w:r>
         <w:t xml:space="preserve"> </w:t>
@@ -107,42 +104,21 @@
           <w:b/>
           <w:bCs/>
         </w:rPr>
-        <w:t xml:space="preserve">cut idle compute and saved ~$45k/year</w:t>
-      </w:r>
-      <w:r>
-        <w:t xml:space="preserve">. On a GenAI extraction platform, I architected a</w:t>
-      </w:r>
-      <w:r>
-        <w:t xml:space="preserve"> </w:t>
-      </w:r>
-      <w:r>
-        <w:rPr>
-          <w:b/>
-          <w:bCs/>
-        </w:rPr>
-        <w:t xml:space="preserve">Field-Aware Extraction Engine processing 2M+ records/month</w:t>
-      </w:r>
-      <w:r>
-        <w:t xml:space="preserve"> </w:t>
-      </w:r>
-      <w:r>
-        <w:t xml:space="preserve">and a routing layer that</w:t>
-      </w:r>
-      <w:r>
-        <w:t xml:space="preserve"> </w:t>
-      </w:r>
-      <w:r>
-        <w:rPr>
-          <w:b/>
-          <w:bCs/>
-        </w:rPr>
-        <w:t xml:space="preserve">cut token spend ~40%</w:t>
-      </w:r>
-      <w:r>
-        <w:t xml:space="preserve"> </w:t>
-      </w:r>
-      <w:r>
-        <w:t xml:space="preserve">with no measurable accuracy loss. Earlier, I built a distributed document pipeline on</w:t>
+        <w:t xml:space="preserve">~40%</w:t>
+      </w:r>
+      <w:r>
+        <w:t xml:space="preserve"> </w:t>
+      </w:r>
+      <w:r>
+        <w:t xml:space="preserve">with no accuracy loss. These are the event-driven, API-integrated backends the role calls for.</w:t>
+      </w:r>
+    </w:p>
+    <w:p>
+      <w:pPr>
+        <w:pStyle w:val="BodyText"/>
+      </w:pPr>
+      <w:r>
+        <w:t xml:space="preserve">The Python and architecture depth is genuine. At Kuttl I built a distributed document pipeline on</w:t>
       </w:r>
       <w:r>
         <w:t xml:space="preserve"> </w:t>
@@ -168,21 +144,13 @@
           <w:b/>
           <w:bCs/>
         </w:rPr>
-        <w:t xml:space="preserve">50k+ messages/day</w:t>
-      </w:r>
-      <w:r>
-        <w:t xml:space="preserve"> </w:t>
-      </w:r>
-      <w:r>
-        <w:t xml:space="preserve">with retry logic and dead-letter queues so no data is lost.</w:t>
-      </w:r>
-    </w:p>
-    <w:p>
-      <w:pPr>
-        <w:pStyle w:val="BodyText"/>
-      </w:pPr>
-      <w:r>
-        <w:t xml:space="preserve">The stack you describe is the one I work in daily:</w:t>
+        <w:t xml:space="preserve">50k+ daily messages</w:t>
+      </w:r>
+      <w:r>
+        <w:t xml:space="preserve"> </w:t>
+      </w:r>
+      <w:r>
+        <w:t xml:space="preserve">with asynchronous, event-driven processing, retries, and dead-letter queues, and fine-tuned Llama-3-8B to cut inference cost</w:t>
       </w:r>
       <w:r>
         <w:t xml:space="preserve"> </w:t>
@@ -192,10 +160,10 @@
           <w:b/>
           <w:bCs/>
         </w:rPr>
-        <w:t xml:space="preserve">Python (FastAPI)</w:t>
-      </w:r>
-      <w:r>
-        <w:t xml:space="preserve">,</w:t>
+        <w:t xml:space="preserve">90%</w:t>
+      </w:r>
+      <w:r>
+        <w:t xml:space="preserve">. Earlier, I led a Strangler-Fig migration to Spring Boot</w:t>
       </w:r>
       <w:r>
         <w:t xml:space="preserve"> </w:t>
@@ -205,65 +173,13 @@
           <w:b/>
           <w:bCs/>
         </w:rPr>
-        <w:t xml:space="preserve">LangChain and LlamaIndex</w:t>
-      </w:r>
-      <w:r>
-        <w:t xml:space="preserve">,</w:t>
-      </w:r>
-      <w:r>
-        <w:t xml:space="preserve"> </w:t>
-      </w:r>
-      <w:r>
-        <w:rPr>
-          <w:b/>
-          <w:bCs/>
-        </w:rPr>
-        <w:t xml:space="preserve">PostgreSQL and MongoDB</w:t>
-      </w:r>
-      <w:r>
-        <w:t xml:space="preserve">,</w:t>
-      </w:r>
-      <w:r>
-        <w:t xml:space="preserve"> </w:t>
-      </w:r>
-      <w:r>
-        <w:rPr>
-          <w:b/>
-          <w:bCs/>
-        </w:rPr>
-        <w:t xml:space="preserve">Kubernetes and Docker</w:t>
-      </w:r>
-      <w:r>
-        <w:t xml:space="preserve">, and</w:t>
-      </w:r>
-      <w:r>
-        <w:t xml:space="preserve"> </w:t>
-      </w:r>
-      <w:r>
-        <w:rPr>
-          <w:b/>
-          <w:bCs/>
-        </w:rPr>
-        <w:t xml:space="preserve">CI/CD</w:t>
-      </w:r>
-      <w:r>
-        <w:t xml:space="preserve"> </w:t>
-      </w:r>
-      <w:r>
-        <w:t xml:space="preserve">across</w:t>
-      </w:r>
-      <w:r>
-        <w:t xml:space="preserve"> </w:t>
-      </w:r>
-      <w:r>
-        <w:rPr>
-          <w:b/>
-          <w:bCs/>
-        </w:rPr>
-        <w:t xml:space="preserve">AWS and Azure</w:t>
-      </w:r>
-      <w:r>
-        <w:t xml:space="preserve">. I also care about the engineering underneath, applying</w:t>
+        <w:t xml:space="preserve">microservices</w:t>
+      </w:r>
+      <w:r>
+        <w:t xml:space="preserve"> </w:t>
+      </w:r>
+      <w:r>
+        <w:t xml:space="preserve">on</w:t>
       </w:r>
       <w:r>
         <w:t xml:space="preserve"> </w:t>
@@ -279,7 +195,7 @@
         <w:t xml:space="preserve"> </w:t>
       </w:r>
       <w:r>
-        <w:t xml:space="preserve">principles when I led a Strangler-Fig migration to Spring Boot microservices that</w:t>
+        <w:t xml:space="preserve">principles, and ran high-scale services on</w:t>
       </w:r>
       <w:r>
         <w:t xml:space="preserve"> </w:t>
@@ -289,10 +205,13 @@
           <w:b/>
           <w:bCs/>
         </w:rPr>
-        <w:t xml:space="preserve">cut cyclomatic complexity ~42%</w:t>
-      </w:r>
-      <w:r>
-        <w:t xml:space="preserve">. I partner naturally with product, ML, and DevOps teams because shipping reliable AI for clients depends on that collaboration.</w:t>
+        <w:t xml:space="preserve">Kubernetes</w:t>
+      </w:r>
+      <w:r>
+        <w:t xml:space="preserve"> </w:t>
+      </w:r>
+      <w:r>
+        <w:t xml:space="preserve">and AWS. I work fluidly across Python and Java, relational and NoSQL stores, and CI/CD.</w:t>
       </w:r>
     </w:p>
     <w:p>
@@ -300,7 +219,15 @@
         <w:pStyle w:val="BodyText"/>
       </w:pPr>
       <w:r>
-        <w:t xml:space="preserve">What draws me to PwC specifically is the range: solving GenAI problems across many clients and industries rather than one product, with the quality bar an AC engagement demands. I would welcome the chance to bring my agentic AI and backend experience to that work.</w:t>
+        <w:t xml:space="preserve">What draws me to PwC specifically is the breadth: shipping reliable GenAI across many clients and domains, not one product, is a harder and more interesting engineering problem, and the quality bar the ACs are known for matches how I like to build.</w:t>
+      </w:r>
+    </w:p>
+    <w:p>
+      <w:pPr>
+        <w:pStyle w:val="BodyText"/>
+      </w:pPr>
+      <w:r>
+        <w:t xml:space="preserve">I would welcome the chance to discuss how I can contribute.</w:t>
       </w:r>
     </w:p>
     <w:p>

</xml_diff>